<commit_message>
Fix diacritic placement, equal column widths, populate Coptic names in fathers litany
- Diacritics (jinkim and overline) now placed BEFORE base letter so they render over the correct letter in Avva_Shenouda font (both marks are zero-width with rightward ink)
- Top-folder docx tables now use evenly distributed column widths (autofit disabled)
- Add capital vita mapping Ⲃ→B to both generators
- Populate Coptic names in fathers litany: Ⲑⲉⲟⲇⲱⲣⲟⲥ, Ⲁⲫⲣⲉⲙ, Ⲃⲁⲥⲓⲗⲓⲟⲥ, Ⲓⲱⲥⲏⲫ
- Correct Eritrea patriarch English name: Antonios I → Bacilios (all 4 source files)
- Regenerate all 4 docx files
</commit_message>
<xml_diff>
--- a/divine-liturgy_deacon_responses.docx
+++ b/divine-liturgy_deacon_responses.docx
@@ -19,15 +19,15 @@
       <w:tblPr>
         <w:tblW w:type="auto" w:w="0"/>
         <w:jc w:val="center"/>
-        <w:tblLayout w:type="autofit"/>
+        <w:tblLayout w:type="fixed"/>
         <w:tblLook w:firstColumn="1" w:firstRow="1" w:lastColumn="0" w:lastRow="0" w:noHBand="0" w:noVBand="1" w:val="04A0"/>
       </w:tblPr>
       <w:tblGrid>
-        <w:gridCol w:w="3123"/>
-        <w:gridCol w:w="3123"/>
-        <w:gridCol w:w="3123"/>
-        <w:gridCol w:w="3123"/>
-        <w:gridCol w:w="3123"/>
+        <w:gridCol w:w="3118"/>
+        <w:gridCol w:w="3118"/>
+        <w:gridCol w:w="3118"/>
+        <w:gridCol w:w="3118"/>
+        <w:gridCol w:w="3118"/>
       </w:tblGrid>
       <w:tr>
         <w:trPr>
@@ -35,7 +35,7 @@
         </w:trPr>
         <w:tc>
           <w:tcPr>
-            <w:tcW w:type="dxa" w:w="1247"/>
+            <w:tcW w:type="dxa" w:w="3118"/>
             <w:shd w:fill="D9E2F3"/>
           </w:tcPr>
           <w:p>
@@ -73,7 +73,7 @@
         </w:tc>
         <w:tc>
           <w:tcPr>
-            <w:tcW w:type="dxa" w:w="3402"/>
+            <w:tcW w:type="dxa" w:w="3118"/>
             <w:shd w:fill="D9E2F3"/>
           </w:tcPr>
           <w:p>
@@ -135,7 +135,7 @@
         </w:trPr>
         <w:tc>
           <w:tcPr>
-            <w:tcW w:type="dxa" w:w="1247"/>
+            <w:tcW w:type="dxa" w:w="3118"/>
           </w:tcPr>
           <w:p>
             <w:pPr>
@@ -167,7 +167,7 @@
         </w:tc>
         <w:tc>
           <w:tcPr>
-            <w:tcW w:type="dxa" w:w="3402"/>
+            <w:tcW w:type="dxa" w:w="3118"/>
           </w:tcPr>
           <w:p>
             <w:pPr>
@@ -175,9 +175,10 @@
             </w:pPr>
             <w:r>
               <w:rPr>
+                <w:rFonts w:ascii="Avva_Shenouda" w:hAnsi="Avva_Shenouda" w:eastAsia="Avva_Shenouda" w:cs="Avva_Shenouda"/>
                 <w:sz w:val="10"/>
               </w:rPr>
-              <w:t>Ⲡⲣⲟⲥⲉⲩⲝⲁⲥⲑⲉ ⲩ̀ⲡⲉⲣ ⲧⲱⲛ ⲁ̀ⲅⲓⲱⲛ ⲧⲓⲙⲓⲱⲛ ⲇⲱⲣⲟⲛ ⲧⲟⲩⲧⲱⲛ ⲕⲉ ⲑⲩⲥⲓⲱⲛ ⲏ̀ⲙⲱⲛ ⲕⲉ ⲡⲣⲟⲥⲫⲉⲣⲟⲛⲧⲱⲛ: Ⲕⲩⲣⲓⲉ ⲉ̀ⲗⲉⲏ̀ⲥⲟⲛ.</w:t>
+              <w:t>Procev7ac0e `vper twn `agiwn timiwn dwron tovtwn ke 0vciwn `3mwn ke procferontwn: Kvrie `ele`3con.</w:t>
             </w:r>
           </w:p>
         </w:tc>
@@ -221,7 +222,7 @@
         </w:trPr>
         <w:tc>
           <w:tcPr>
-            <w:tcW w:type="dxa" w:w="1247"/>
+            <w:tcW w:type="dxa" w:w="3118"/>
           </w:tcPr>
           <w:p>
             <w:pPr>
@@ -253,7 +254,7 @@
         </w:tc>
         <w:tc>
           <w:tcPr>
-            <w:tcW w:type="dxa" w:w="3402"/>
+            <w:tcW w:type="dxa" w:w="3118"/>
           </w:tcPr>
           <w:p>
             <w:pPr>
@@ -261,9 +262,10 @@
             </w:pPr>
             <w:r>
               <w:rPr>
+                <w:rFonts w:ascii="Avva_Shenouda" w:hAnsi="Avva_Shenouda" w:eastAsia="Avva_Shenouda" w:cs="Avva_Shenouda"/>
                 <w:sz w:val="10"/>
               </w:rPr>
-              <w:t>Ⲁ̀ⲙⲏⲛ. Ⲓⲥ Ⲡⲁⲧⲏⲣ ⲁ̀ⲅⲓⲟⲥ: ⲓⲥ Ⲩ̀ⲓⲟⲥ ⲁ̀ⲅⲓⲟⲥ: ⲉⲛ Ⲡ̀ⲛⲉⲩⲙⲁ Ⲁ̀ⲅⲓⲟⲛ. Ⲁ̀ⲙⲏⲛ. Ⲉⲩⲗⲟⲅⲓⲧⲟⲥ Ⲕⲩⲣⲓⲟⲥ ⲟ̀ Ⲑⲉⲟⲥ ⲓⲥ ⲧⲟⲩⲥ ⲉ̀ⲱ̀ⲛⲁⲥ. Ⲁ̀ⲙⲏⲛ. Ⲛⲓⲉⲑⲛⲟⲥ ⲧⲏⲣⲟⲩ ⲥ̀ⲙⲟⲩ ⲉ̀Ⲡ̀ⲟ̅ⲥ̅: ⲙⲁⲣⲟⲩⲥ̀ⲙⲟⲩ ⲉ̀ⲣⲟϥ ⲛ̀ϫⲉ ⲛⲓⲗⲁⲟⲥ ⲧⲏⲣⲟⲩ: ϫⲉ ⲁ̀ ⲡⲉϥⲛⲁⲓ ⲧⲁϫⲣⲟ ⲉ̀ϩ̀ⲣⲏⲓ ⲉ̀ϫⲱⲛ: ⲟⲩⲟϩ ϯⲙⲉⲑⲙⲏⲓ ⲛ̀ⲧⲉ Ⲡ̀ⲟ̅ⲥ̅ ϣⲟⲡ ϣⲁ ⲉ̀ⲛⲉϩ. Ⲁ̀ⲙⲏⲛ ⲁⲗⲗⲏⲗⲟⲩⲓⲁ.</w:t>
+              <w:t>`Am3n. Ic Pat3r `agioc: ic `Vioc `agioc: en `Pnevma `Agion. `Am3n. Evlogitoc Kvrioc `o )eoc ic tovc `e`wnac. `Am3n. Nie0noc t3rov `cmov `e`P=o=c: marov`cmov `ero4 `nge nilaoc t3rov: ge `a pe4nai tagro `e`hr3i `egwn: ovoh 5me0m3i `nte `P=o=c 2op 2a `eneh. `Am3n all3lovia.</w:t>
             </w:r>
           </w:p>
         </w:tc>
@@ -307,7 +309,7 @@
         </w:trPr>
         <w:tc>
           <w:tcPr>
-            <w:tcW w:type="dxa" w:w="1247"/>
+            <w:tcW w:type="dxa" w:w="3118"/>
           </w:tcPr>
           <w:p>
             <w:pPr>
@@ -339,7 +341,7 @@
         </w:tc>
         <w:tc>
           <w:tcPr>
-            <w:tcW w:type="dxa" w:w="3402"/>
+            <w:tcW w:type="dxa" w:w="3118"/>
           </w:tcPr>
           <w:p>
             <w:pPr>
@@ -347,9 +349,10 @@
             </w:pPr>
             <w:r>
               <w:rPr>
+                <w:rFonts w:ascii="Avva_Shenouda" w:hAnsi="Avva_Shenouda" w:eastAsia="Avva_Shenouda" w:cs="Avva_Shenouda"/>
                 <w:sz w:val="10"/>
               </w:rPr>
-              <w:t>Ⲧⲱⲃϩ ϩⲓⲛⲁ ⲛ̀ⲧⲉ Ⲫϯ ⲛⲁⲓ ⲛⲁⲛ: ⲛ̀ⲧⲉϥϣⲉⲛϩⲏⲧ ϧⲁⲣⲟⲛ: ⲛ̀ⲧⲉϥⲥⲱⲧⲉⲙ ⲉ̀ⲣⲟⲛ: ⲛ̀ⲧⲉϥⲉⲣⲃⲟⲏⲑⲓⲛ ⲉ̀ⲣⲟⲛ: ⲛ̀ⲧⲉϥϭⲓ ⲛ̀ⲛⲓϯϩⲟ ⲛⲉⲙ ⲛⲓⲧⲱⲃϩ ⲛ̀ⲧⲉ ⲛⲏ ⲉⲑⲟⲩⲁⲃ ⲛ̀ⲧⲁϥ ⲛ̀ⲧⲟⲧⲟⲩ ⲉ̀ϩ̀ⲣⲏⲓ ⲉ̀ϫⲱⲛ ⲉ̀ⲡⲓⲁ̀ⲅⲁⲑⲟⲛ ⲛ̀ⲥⲏⲟⲩ ⲛⲓⲃⲉⲛ. Ⲛ̀ⲧⲉϥⲁⲓⲧⲉⲛ ⲛ̀ⲉⲙⲡ̀ϣⲁ ⲉⲑⲣⲉⲛϭⲓ ⲉ̀ⲃⲟⲗϧⲉⲛ ϯⲕⲟⲓⲛⲱⲛⲓⲁ ⲛ̀ⲧⲉ ⲛⲉϥⲙⲩⲥⲧⲏⲣⲓⲟⲛ ⲉ̅ⲑ̅ⲩ̅: ⲉⲧ̀ⲥ̀ⲙⲁⲣⲱⲟⲩⲧ ⲉ̀ⲡⲓⲭⲱ ⲉ̀ⲃⲟⲗ ⲛ̀ⲧⲉ ⲛⲉⲛⲛⲟⲃⲓ.</w:t>
+              <w:t>Twbh hina `nte F5 nai nan: `nte42enh3t qaron: `nte4cwtem `eron: `nte4erbo30in `eron: `nte4[i `nni5ho nem nitwbh `nte n3 e0ovab `nta4 `ntotov `e`hr3i `egwn `epi`aga0on `nc3ov niben. `Nte4aiten `nem`p2a e0ren[i `ebolqen 5koinwnia `nte ne4mvct3rion =e=0=v: e`t`cmarwovt `epixw `ebol `nte nennobi.</w:t>
             </w:r>
           </w:p>
         </w:tc>
@@ -393,7 +396,7 @@
         </w:trPr>
         <w:tc>
           <w:tcPr>
-            <w:tcW w:type="dxa" w:w="1247"/>
+            <w:tcW w:type="dxa" w:w="3118"/>
           </w:tcPr>
           <w:p>
             <w:pPr>
@@ -424,7 +427,7 @@
         </w:tc>
         <w:tc>
           <w:tcPr>
-            <w:tcW w:type="dxa" w:w="3402"/>
+            <w:tcW w:type="dxa" w:w="3118"/>
           </w:tcPr>
           <w:p>
             <w:pPr>
@@ -432,6 +435,7 @@
             </w:pPr>
             <w:r>
               <w:rPr>
+                <w:rFonts w:ascii="Avva_Shenouda" w:hAnsi="Avva_Shenouda" w:eastAsia="Avva_Shenouda" w:cs="Avva_Shenouda"/>
                 <w:sz w:val="10"/>
               </w:rPr>
             </w:r>
@@ -466,7 +470,7 @@
         </w:trPr>
         <w:tc>
           <w:tcPr>
-            <w:tcW w:type="dxa" w:w="1247"/>
+            <w:tcW w:type="dxa" w:w="3118"/>
           </w:tcPr>
           <w:p>
             <w:pPr>
@@ -498,7 +502,7 @@
         </w:tc>
         <w:tc>
           <w:tcPr>
-            <w:tcW w:type="dxa" w:w="3402"/>
+            <w:tcW w:type="dxa" w:w="3118"/>
           </w:tcPr>
           <w:p>
             <w:pPr>
@@ -506,9 +510,10 @@
             </w:pPr>
             <w:r>
               <w:rPr>
+                <w:rFonts w:ascii="Avva_Shenouda" w:hAnsi="Avva_Shenouda" w:eastAsia="Avva_Shenouda" w:cs="Avva_Shenouda"/>
                 <w:sz w:val="10"/>
               </w:rPr>
-              <w:t>Ⲉⲛⲥⲟⲫⲓⲁ Ⲑⲉⲟⲩ ⲡ̀ⲣⲟⲥⲭⲱⲙⲉⲛ. Ⲕⲩⲣⲓⲉ ⲉ̀ⲗⲉⲏ̀ⲥⲟⲛ: Ⲕⲩⲣⲓⲉ ⲉ̀ⲗⲉⲏ̀ⲥⲟⲛ. Ϧⲉⲛ ⲟⲩⲙⲉⲑⲙⲏⲓ</w:t>
+              <w:t>Encofia )eov `procxwmen. Kvrie `ele`3con: Kvrie `ele`3con. Qen ovme0m3i</w:t>
             </w:r>
           </w:p>
         </w:tc>
@@ -552,7 +557,7 @@
         </w:trPr>
         <w:tc>
           <w:tcPr>
-            <w:tcW w:type="dxa" w:w="1247"/>
+            <w:tcW w:type="dxa" w:w="3118"/>
           </w:tcPr>
           <w:p>
             <w:pPr>
@@ -584,7 +589,7 @@
         </w:tc>
         <w:tc>
           <w:tcPr>
-            <w:tcW w:type="dxa" w:w="3402"/>
+            <w:tcW w:type="dxa" w:w="3118"/>
           </w:tcPr>
           <w:p>
             <w:pPr>
@@ -592,9 +597,10 @@
             </w:pPr>
             <w:r>
               <w:rPr>
+                <w:rFonts w:ascii="Avva_Shenouda" w:hAnsi="Avva_Shenouda" w:eastAsia="Avva_Shenouda" w:cs="Avva_Shenouda"/>
                 <w:sz w:val="10"/>
               </w:rPr>
-              <w:t>Ⲡ̀ⲣⲟⲥⲉⲩⲝⲁⲥⲑⲉ ⲩ̀ⲡⲉⲣ ⲧⲏⲥ ⲧⲉⲗⲓⲁⲥ ⲓ̀ⲣⲏⲛⲏⲥ ⲕⲉ ⲁ̀ⲅⲁⲡⲏⲥ ⲕⲉ ⲧⲱⲛ ⲁ̀ⲅⲓⲱⲛ ⲁⲥⲡⲁⲥⲙⲟⲛ ⲁ̀ⲡⲟⲥⲧⲟⲗⲱⲛ.</w:t>
+              <w:t>`Procev7ac0e `vper t3c teliac `ir3n3c ke `agap3c ke twn `agiwn acpacmon `apoctolwn.</w:t>
             </w:r>
           </w:p>
         </w:tc>
@@ -638,7 +644,7 @@
         </w:trPr>
         <w:tc>
           <w:tcPr>
-            <w:tcW w:type="dxa" w:w="1247"/>
+            <w:tcW w:type="dxa" w:w="3118"/>
           </w:tcPr>
           <w:p>
             <w:pPr>
@@ -670,7 +676,7 @@
         </w:tc>
         <w:tc>
           <w:tcPr>
-            <w:tcW w:type="dxa" w:w="3402"/>
+            <w:tcW w:type="dxa" w:w="3118"/>
           </w:tcPr>
           <w:p>
             <w:pPr>
@@ -678,9 +684,10 @@
             </w:pPr>
             <w:r>
               <w:rPr>
+                <w:rFonts w:ascii="Avva_Shenouda" w:hAnsi="Avva_Shenouda" w:eastAsia="Avva_Shenouda" w:cs="Avva_Shenouda"/>
                 <w:sz w:val="10"/>
               </w:rPr>
-              <w:t>Ⲁⲥⲡⲁⲍⲉⲥⲑⲉ ⲁⲗⲗⲏⲗⲟⲩⲥ ⲉⲛ ⲫⲓⲗⲏⲙⲁⲧⲓ ⲁ̀ⲅⲓⲱ. Ⲕⲩⲣⲓⲉ ⲉ̀ⲗⲉⲏ̀ⲥⲟⲛ: Ⲕⲩⲣⲓⲉ ⲉ̀ⲗⲉⲏ̀ⲥⲟⲛ: Ⲕⲩⲣⲓⲉ ⲉ̀ⲗⲉⲏ̀ⲥⲟⲛ. Ⲥⲉ Ⲕⲩⲣⲓⲉ: ⲉ̀ⲧⲉ ⲫⲁⲓ ⲡⲉ Ⲓⲏⲥⲟⲩⲥ Ⲡⲓⲭ̀ⲣⲓⲥⲧⲟⲥ Ⲡ̀ϣⲏⲣⲓ ⲙ̀Ⲫ̀ⲛⲟⲩϯ ⲥⲱⲧⲉⲙ ⲉ̀ⲣⲟⲛ ⲟⲩⲟϩ ⲛⲁⲓ ⲛⲁⲛ. Ⲡ̀ⲣⲟⲥⲫⲉⲣⲓⲛ ⲕⲁⲧⲁ ⲧ̀ⲣⲟⲡⲟⲛ: ⲥ̀ⲧⲁⲑⲏⲧⲉ ⲕⲁⲧⲁ ⲧ̀ⲣⲟⲙⲟⲩ: ⲓⲥ ⲁ̀ⲛⲁⲧⲟⲗⲁⲥ ⲃ̀ⲗⲉⲯⲁⲧⲉ: Ⲡ̀ⲣⲟⲥⲭⲱⲙⲉⲛ.</w:t>
+              <w:t>Acpazec0e all3lovc en fil3mati `agiw. Kvrie `ele`3con: Kvrie `ele`3con: Kvrie `ele`3con. Ce Kvrie: `ete fai pe I3covc Pi`xrictoc `P23ri `m`Fnov5 cwtem `eron ovoh nai nan. `Procferin kata `tropon: `cta03te kata `tromov: ic `anatolac `bleyate: `Procxwmen.</w:t>
             </w:r>
           </w:p>
         </w:tc>
@@ -724,7 +731,7 @@
         </w:trPr>
         <w:tc>
           <w:tcPr>
-            <w:tcW w:type="dxa" w:w="1247"/>
+            <w:tcW w:type="dxa" w:w="3118"/>
           </w:tcPr>
           <w:p>
             <w:pPr>
@@ -756,7 +763,7 @@
         </w:tc>
         <w:tc>
           <w:tcPr>
-            <w:tcW w:type="dxa" w:w="3402"/>
+            <w:tcW w:type="dxa" w:w="3118"/>
           </w:tcPr>
           <w:p>
             <w:pPr>
@@ -764,9 +771,10 @@
             </w:pPr>
             <w:r>
               <w:rPr>
+                <w:rFonts w:ascii="Avva_Shenouda" w:hAnsi="Avva_Shenouda" w:eastAsia="Avva_Shenouda" w:cs="Avva_Shenouda"/>
                 <w:sz w:val="10"/>
               </w:rPr>
-              <w:t>Ⲉⲛⲥⲟⲫⲓⲁ Ⲑⲉⲟⲩ ⲡ̀ⲣⲟⲥⲭⲱⲙⲉⲛ. Ⲕⲩⲣⲓⲉ ⲉ̀ⲗⲉⲏ̀ⲥⲟⲛ: Ⲕⲩⲣⲓⲉ ⲉ̀ⲗⲉⲏ̀ⲥⲟⲛ. Ϧⲉⲛ ⲟⲩⲙⲉⲑⲙⲏⲓ</w:t>
+              <w:t>Encofia )eov `procxwmen. Kvrie `ele`3con: Kvrie `ele`3con. Qen ovme0m3i</w:t>
             </w:r>
           </w:p>
         </w:tc>
@@ -810,7 +818,7 @@
         </w:trPr>
         <w:tc>
           <w:tcPr>
-            <w:tcW w:type="dxa" w:w="1247"/>
+            <w:tcW w:type="dxa" w:w="3118"/>
           </w:tcPr>
           <w:p>
             <w:pPr>
@@ -842,7 +850,7 @@
         </w:tc>
         <w:tc>
           <w:tcPr>
-            <w:tcW w:type="dxa" w:w="3402"/>
+            <w:tcW w:type="dxa" w:w="3118"/>
           </w:tcPr>
           <w:p>
             <w:pPr>
@@ -850,9 +858,10 @@
             </w:pPr>
             <w:r>
               <w:rPr>
+                <w:rFonts w:ascii="Avva_Shenouda" w:hAnsi="Avva_Shenouda" w:eastAsia="Avva_Shenouda" w:cs="Avva_Shenouda"/>
                 <w:sz w:val="10"/>
               </w:rPr>
-              <w:t>Ⲓ̀ ⲕⲁⲑⲏⲙⲉⲛⲓ ⲁ̀ⲛⲁⲥⲑⲏⲧⲉ.</w:t>
+              <w:t>`I ka03meni `anac03te.</w:t>
             </w:r>
           </w:p>
         </w:tc>
@@ -896,7 +905,7 @@
         </w:trPr>
         <w:tc>
           <w:tcPr>
-            <w:tcW w:type="dxa" w:w="1247"/>
+            <w:tcW w:type="dxa" w:w="3118"/>
           </w:tcPr>
           <w:p>
             <w:pPr>
@@ -928,7 +937,7 @@
         </w:tc>
         <w:tc>
           <w:tcPr>
-            <w:tcW w:type="dxa" w:w="3402"/>
+            <w:tcW w:type="dxa" w:w="3118"/>
           </w:tcPr>
           <w:p>
             <w:pPr>
@@ -936,9 +945,10 @@
             </w:pPr>
             <w:r>
               <w:rPr>
+                <w:rFonts w:ascii="Avva_Shenouda" w:hAnsi="Avva_Shenouda" w:eastAsia="Avva_Shenouda" w:cs="Avva_Shenouda"/>
                 <w:sz w:val="10"/>
               </w:rPr>
-              <w:t>Ⲓⲥ ⲁ̀ⲛⲁⲧⲟⲗⲁⲥ ⲃ̀ⲗⲉⲯⲁⲧⲉ</w:t>
+              <w:t>Ic `anatolac `bleyate</w:t>
             </w:r>
           </w:p>
         </w:tc>
@@ -982,7 +992,7 @@
         </w:trPr>
         <w:tc>
           <w:tcPr>
-            <w:tcW w:type="dxa" w:w="1247"/>
+            <w:tcW w:type="dxa" w:w="3118"/>
           </w:tcPr>
           <w:p>
             <w:pPr>
@@ -1014,7 +1024,7 @@
         </w:tc>
         <w:tc>
           <w:tcPr>
-            <w:tcW w:type="dxa" w:w="3402"/>
+            <w:tcW w:type="dxa" w:w="3118"/>
           </w:tcPr>
           <w:p>
             <w:pPr>
@@ -1022,9 +1032,10 @@
             </w:pPr>
             <w:r>
               <w:rPr>
+                <w:rFonts w:ascii="Avva_Shenouda" w:hAnsi="Avva_Shenouda" w:eastAsia="Avva_Shenouda" w:cs="Avva_Shenouda"/>
                 <w:sz w:val="10"/>
               </w:rPr>
-              <w:t>Ⲡ̀ⲣⲟⲥⲭⲱⲙⲉⲛ.</w:t>
+              <w:t>`Procxwmen.</w:t>
             </w:r>
           </w:p>
         </w:tc>
@@ -1068,7 +1079,7 @@
         </w:trPr>
         <w:tc>
           <w:tcPr>
-            <w:tcW w:type="dxa" w:w="1247"/>
+            <w:tcW w:type="dxa" w:w="3118"/>
           </w:tcPr>
           <w:p>
             <w:pPr>
@@ -1100,7 +1111,7 @@
         </w:tc>
         <w:tc>
           <w:tcPr>
-            <w:tcW w:type="dxa" w:w="3402"/>
+            <w:tcW w:type="dxa" w:w="3118"/>
           </w:tcPr>
           <w:p>
             <w:pPr>
@@ -1108,9 +1119,10 @@
             </w:pPr>
             <w:r>
               <w:rPr>
+                <w:rFonts w:ascii="Avva_Shenouda" w:hAnsi="Avva_Shenouda" w:eastAsia="Avva_Shenouda" w:cs="Avva_Shenouda"/>
                 <w:sz w:val="10"/>
               </w:rPr>
-              <w:t>Ⲟⲩⲱϣⲧ ⲙ̀Ⲫ̀ⲛⲟⲩϯ ϧⲉⲛ ⲟⲩϩⲟϯ ⲛⲉⲙ ⲟⲩⲥ̀ⲑⲉⲣⲧⲉⲣ.</w:t>
+              <w:t>Ovw2t `m`Fnov5 qen ovho5 nem ov`c0erter.</w:t>
             </w:r>
           </w:p>
         </w:tc>
@@ -1154,7 +1166,7 @@
         </w:trPr>
         <w:tc>
           <w:tcPr>
-            <w:tcW w:type="dxa" w:w="1247"/>
+            <w:tcW w:type="dxa" w:w="3118"/>
           </w:tcPr>
           <w:p>
             <w:pPr>
@@ -1186,7 +1198,7 @@
         </w:tc>
         <w:tc>
           <w:tcPr>
-            <w:tcW w:type="dxa" w:w="3402"/>
+            <w:tcW w:type="dxa" w:w="3118"/>
           </w:tcPr>
           <w:p>
             <w:pPr>
@@ -1194,9 +1206,10 @@
             </w:pPr>
             <w:r>
               <w:rPr>
+                <w:rFonts w:ascii="Avva_Shenouda" w:hAnsi="Avva_Shenouda" w:eastAsia="Avva_Shenouda" w:cs="Avva_Shenouda"/>
                 <w:sz w:val="10"/>
               </w:rPr>
-              <w:t>Ⲡ̀ⲣⲟⲥⲭⲱⲙⲉⲛ: ⲁ̀ⲙⲏⲛ.</w:t>
+              <w:t>`Procxwmen: `am3n.</w:t>
             </w:r>
           </w:p>
         </w:tc>
@@ -1240,7 +1253,7 @@
         </w:trPr>
         <w:tc>
           <w:tcPr>
-            <w:tcW w:type="dxa" w:w="1247"/>
+            <w:tcW w:type="dxa" w:w="3118"/>
           </w:tcPr>
           <w:p>
             <w:pPr>
@@ -1272,7 +1285,7 @@
         </w:tc>
         <w:tc>
           <w:tcPr>
-            <w:tcW w:type="dxa" w:w="3402"/>
+            <w:tcW w:type="dxa" w:w="3118"/>
           </w:tcPr>
           <w:p>
             <w:pPr>
@@ -1280,9 +1293,10 @@
             </w:pPr>
             <w:r>
               <w:rPr>
+                <w:rFonts w:ascii="Avva_Shenouda" w:hAnsi="Avva_Shenouda" w:eastAsia="Avva_Shenouda" w:cs="Avva_Shenouda"/>
                 <w:sz w:val="10"/>
               </w:rPr>
-              <w:t>Ⲡⲣⲟⲥⲉⲩⲝⲁⲥⲑⲉ ⲩ̀ⲡⲉⲣ ⲧⲏⲥ ⲓ̀ⲣⲏⲛⲏⲥ ⲧⲏⲥ ⲁ̀ⲅⲓⲁⲥ ⲙⲟⲛⲏⲥ ⲕⲁⲑⲟⲗⲓⲕⲏⲥ ⲕⲉ ⲁ̀ⲡⲟⲥⲧⲟⲗⲓⲕⲏⲥ ⲟⲣⲑⲟⲇⲟⲝⲟⲩ ⲧⲟⲩ Ⲑⲉⲟⲩ ⲉⲕⲕⲗⲏⲥⲓⲁⲥ.</w:t>
+              <w:t>Procev7ac0e `vper t3c `ir3n3c t3c `agiac mon3c ka0olik3c ke `apoctolik3c or0odo7ov tov )eov ekkl3ciac.</w:t>
             </w:r>
           </w:p>
         </w:tc>
@@ -1326,7 +1340,7 @@
         </w:trPr>
         <w:tc>
           <w:tcPr>
-            <w:tcW w:type="dxa" w:w="1247"/>
+            <w:tcW w:type="dxa" w:w="3118"/>
           </w:tcPr>
           <w:p>
             <w:pPr>
@@ -1352,13 +1366,13 @@
               <w:rPr>
                 <w:sz w:val="10"/>
               </w:rPr>
-              <w:t>Pray for our archpriest Pope Abba Tawadrous II, pope and patriarch and archbishop of the great city of Alexandria,And his spiritual brethren in the apostolic liturgy, the patriarch of Antioch Mar Ignatius Aphrem and the Patriarch of Eritrea Abouna Antonios I, and his partner in the apostolic liturgy our father the Metropolitan Abba (Youssef) and for our orthodox bishops.</w:t>
+              <w:t>Pray for our archpriest Pope Abba Tawadrous II, pope and patriarch and archbishop of the great city of Alexandria,And his spiritual brethren in the apostolic liturgy, the patriarch of Antioch Mar Ignatius Aphrem and the Patriarch of Eritrea Abouna Bacilios, and his partner in the apostolic liturgy our father the Metropolitan Abba (Youssef) and for our orthodox bishops.</w:t>
             </w:r>
           </w:p>
         </w:tc>
         <w:tc>
           <w:tcPr>
-            <w:tcW w:type="dxa" w:w="3402"/>
+            <w:tcW w:type="dxa" w:w="3118"/>
           </w:tcPr>
           <w:p>
             <w:pPr>
@@ -1366,9 +1380,10 @@
             </w:pPr>
             <w:r>
               <w:rPr>
+                <w:rFonts w:ascii="Avva_Shenouda" w:hAnsi="Avva_Shenouda" w:eastAsia="Avva_Shenouda" w:cs="Avva_Shenouda"/>
                 <w:sz w:val="10"/>
               </w:rPr>
-              <w:t>Ⲡ̀ⲣⲟⲥⲉⲩⲝⲁⲥⲑⲉ ⲩ̀ⲡⲉⲣ ⲧⲟⲩⲁⲣⲭⲏⲉ̀ⲣⲉⲱⲥ ⲏ̀ⲙⲱⲛ ⲡⲁⲡⲁ ⲁⲃⲃⲁ (...): ⲡⲁⲡⲁ ⲕⲉ ⲡⲁⲧⲣⲓⲁⲣⲭⲟⲩ ⲕⲉ ⲁⲣⲭⲏⲉ̀ⲡⲓⲥⲕⲟⲡⲟⲩ ⲧⲏⲥ ⲙⲉⲅⲁⲗⲟ ⲡⲟⲗⲉⲱⲥ Ⲁ̀ⲗⲉⲝⲁⲛⲇ̀ⲣⲓⲁⲥ: ⲕⲉ ⲧⲱⲛ ⲁ̀ⲇⲉⲗⲫⲱⲛ ⲁⲩⲧⲟⲩ ⲉⲛ ⲧⲏ ⲁ̀ⲡⲟⲥⲧⲟⲗⲓⲕⲏ ⲗⲓⲧⲟⲩⲣⲅⲓⲁ: Ⲙⲁⲣ Ⲓⲅⲛⲁⲧⲓⲟⲩ (...) ⲧⲟⲩ ⲡⲁⲧⲣⲓⲁⲣⲭⲟⲩ ⲧⲏⲥ Ⲁⲛⲧⲓⲟⲭⲓⲁⲥ: ⲕⲉ Ⲁ̀ⲡⲟⲩⲛⲁ (...) ⲧⲟⲩ ⲡⲁⲧⲣⲓⲁⲣⲭⲟⲩ ⲧⲏⲥ Ⲉ̀ⲣⲓⲧⲣⲉⲁⲥ. Ⲕⲉ ⲧⲟⲩ ⲥⲩⲛⲕⲟⲓⲛⲱⲛⲟⲩ ⲉⲛ ⲧⲏ ⲗⲓⲧⲟⲩⲣⲅⲓⲁ ⲧⲟⲩ ⲡⲁⲧⲣⲟⲥ ⲏ̀ⲙⲱⲛ ⲧⲟⲩ ⲉ̀ⲡⲓⲥⲕⲟⲡⲟⲩ (ⲙⲏⲧⲣⲟⲡⲟⲗⲓⲧⲟⲩ) ⲁⲃⲃⲁ (...). Ⲕⲉ ⲧⲟⲛ ⲟ̀ⲣⲑⲟⲇⲟⲝⲱⲛ ⲏ̀ⲙⲱⲛ ⲉ̀ⲡⲓⲥⲕⲟⲡⲱⲛ.</w:t>
+              <w:t>`Procev7ac0e `vper tovarx3`erewc `3mwn papa abba )eodwroc: papa ke patriarxov ke arx3`epickopov t3c megalo polewc `Ale7an`driac: ke twn `adelfwn avtov en t3 `apoctolik3 litovrgia: Mar Ignatiov Afrem tov patriarxov t3c Antioxiac: ke `Apovna Bacilioc tov patriarxov t3c `Eritreac. Ke tov cvnkoinwnov en t3 litovrgia tov patroc `3mwn tov `epickopov (m3tropolitov) abba Iwc3f. Ke ton `or0odo7wn `3mwn `epickopwn.</w:t>
             </w:r>
           </w:p>
         </w:tc>
@@ -1412,7 +1427,7 @@
         </w:trPr>
         <w:tc>
           <w:tcPr>
-            <w:tcW w:type="dxa" w:w="1247"/>
+            <w:tcW w:type="dxa" w:w="3118"/>
           </w:tcPr>
           <w:p>
             <w:pPr>
@@ -1444,7 +1459,7 @@
         </w:tc>
         <w:tc>
           <w:tcPr>
-            <w:tcW w:type="dxa" w:w="3402"/>
+            <w:tcW w:type="dxa" w:w="3118"/>
           </w:tcPr>
           <w:p>
             <w:pPr>
@@ -1452,9 +1467,10 @@
             </w:pPr>
             <w:r>
               <w:rPr>
+                <w:rFonts w:ascii="Avva_Shenouda" w:hAnsi="Avva_Shenouda" w:eastAsia="Avva_Shenouda" w:cs="Avva_Shenouda"/>
                 <w:sz w:val="10"/>
               </w:rPr>
-              <w:t>Ⲡ̀ⲣⲟⲥⲉⲩⲝⲁⲥⲑⲉ ⲩ̀ⲡⲉⲣ ⲧⲱⲛ ⲏ̀ⲅⲟⲩⲙⲉⲛⲱⲛ ⲕⲉ ⲡ̀ⲣⲉⲥⲃⲩⲧⲉⲣⲱⲛ ⲕⲉ ⲇⲓⲁⲕⲟⲛⲱⲛ ⲕⲉ ⲩ̀ⲡⲟⲇⲓⲁⲕⲱⲛⲱⲛ ⲉⲡⲧⲁ ⲧⲁⲅⲙⲁⲧⲱⲛ ⲧⲟⲩ Ⲑⲉⲟⲩ ⲧⲏⲥ Ⲉⲕⲕⲗⲏⲥⲓⲁⲥ.</w:t>
+              <w:t>`Procev7ac0e `vper twn `3govmenwn ke `precbvterwn ke diakonwn ke `vpodiakwnwn epta tagmatwn tov )eov t3c Ekkl3ciac.</w:t>
             </w:r>
           </w:p>
         </w:tc>
@@ -1498,7 +1514,7 @@
         </w:trPr>
         <w:tc>
           <w:tcPr>
-            <w:tcW w:type="dxa" w:w="1247"/>
+            <w:tcW w:type="dxa" w:w="3118"/>
           </w:tcPr>
           <w:p>
             <w:pPr>
@@ -1530,7 +1546,7 @@
         </w:tc>
         <w:tc>
           <w:tcPr>
-            <w:tcW w:type="dxa" w:w="3402"/>
+            <w:tcW w:type="dxa" w:w="3118"/>
           </w:tcPr>
           <w:p>
             <w:pPr>
@@ -1538,9 +1554,10 @@
             </w:pPr>
             <w:r>
               <w:rPr>
+                <w:rFonts w:ascii="Avva_Shenouda" w:hAnsi="Avva_Shenouda" w:eastAsia="Avva_Shenouda" w:cs="Avva_Shenouda"/>
                 <w:sz w:val="10"/>
               </w:rPr>
-              <w:t>Ⲡ̀ⲣⲟⲥⲉⲩⲝⲁⲥⲑⲉ ⲩ̀ⲡⲉⲣ ⲧⲏⲥ ⲥⲱⲧⲏⲣⲓⲁⲥ ⲧⲟⲩ ⲕⲟⲥⲙⲟⲩ ⲕⲉ ⲧⲏⲥ ⲡⲟⲗⲉⲱⲥ ⲩ̀ⲙⲱⲛ ⲧⲁⲩⲧⲏⲥ ⲕⲉ ⲡⲁⲥⲱⲛ ⲡⲟⲗⲉⲱⲛ: ⲕⲉ ⲧⲱⲛ ⲭⲱⲣⲱⲛ ⲕⲉ ⲛⲏⲥⲱⲛ ⲕⲉ ⲙⲟⲛⲁⲥⲧⲏⲣⲓⲟⲛ.</w:t>
+              <w:t>`Procev7ac0e `vper t3c cwt3riac tov kocmov ke t3c polewc `vmwn tavt3c ke pacwn polewn: ke twn xwrwn ke n3cwn ke monact3rion.</w:t>
             </w:r>
           </w:p>
         </w:tc>
@@ -1584,7 +1601,7 @@
         </w:trPr>
         <w:tc>
           <w:tcPr>
-            <w:tcW w:type="dxa" w:w="1247"/>
+            <w:tcW w:type="dxa" w:w="3118"/>
           </w:tcPr>
           <w:p>
             <w:pPr>
@@ -1616,7 +1633,7 @@
         </w:tc>
         <w:tc>
           <w:tcPr>
-            <w:tcW w:type="dxa" w:w="3402"/>
+            <w:tcW w:type="dxa" w:w="3118"/>
           </w:tcPr>
           <w:p>
             <w:pPr>
@@ -1624,9 +1641,10 @@
             </w:pPr>
             <w:r>
               <w:rPr>
+                <w:rFonts w:ascii="Avva_Shenouda" w:hAnsi="Avva_Shenouda" w:eastAsia="Avva_Shenouda" w:cs="Avva_Shenouda"/>
                 <w:sz w:val="10"/>
               </w:rPr>
-              <w:t>Ⲧⲱⲃϩ ⲉ̀ϫⲉⲛ ⲡ̀ϫⲓⲛⲙⲟϣⲓ ⲉ̀ⲡ̀ϣⲱⲓ ⲛ̀ⲧⲉ ⲛⲓⲓⲁⲣⲱⲟⲩ ⲙ̀ⲙⲱⲟⲩ ϧⲉⲛ ⲧⲁⲓⲣⲟⲙⲡⲓ ⲑⲁⲓ: ϩⲓⲛⲁ ⲛ̀ⲧⲉ Ⲡⲓⲭ̀ⲣⲓⲥⲧⲟⲥ Ⲡⲉⲛⲛⲟⲩϯ ⲥ̀ⲙⲟⲩ ⲉ̀ⲣⲱⲟⲩ: ⲛ̀ⲧⲉϥⲉ̀ⲛⲟⲩ ⲉ̀ⲡ̀ϣⲱⲓ ⲕⲁⲧⲁ ⲛⲟⲩϣⲓ: ⲛ̀ⲧⲉϥϯ ⲙ̀ⲡ̀ⲟⲩⲛⲟϥ ⲙ̀ⲡ̀ϩⲟ ⲙ̀ⲡ̀ⲕⲁϩⲓ: ⲛ̀ⲧⲉϥϣⲁⲛⲟⲩϣⲧⲉⲛ ϧⲁ ⲛⲓϣⲏⲣⲓ ⲛ̀ⲧⲉ ⲛⲓⲣⲱⲙⲓ: ⲛ̀ⲧⲉϥϯ ⲙ̀ⲫ̀ⲛⲟϩⲉⲙ ⲛ̀ⲛⲓⲧⲉⲃⲛⲱⲟⲩⲓ̀: ⲛ̀ⲧⲉϥⲭⲁ ⲛⲉⲛⲛⲟⲃⲓ ⲛⲁⲛ ⲉ̀ⲃⲟⲗ.</w:t>
+              <w:t>Twbh `egen `pginmo2i `e`p2wi `nte niiarwov `mmwov qen tairompi 0ai: hina `nte Pi`xrictoc Pennov5 `cmov `erwov: `nte4`enov `e`p2wi kata nov2i: `nte45 `m`povno4 `m`pho `m`pkahi: `nte42anov2ten qa ni23ri `nte nirwmi: `nte45 `m`fnohem `nnitebnwov`i: `nte4xa nennobi nan `ebol.</w:t>
             </w:r>
           </w:p>
         </w:tc>
@@ -1670,7 +1688,7 @@
         </w:trPr>
         <w:tc>
           <w:tcPr>
-            <w:tcW w:type="dxa" w:w="1247"/>
+            <w:tcW w:type="dxa" w:w="3118"/>
           </w:tcPr>
           <w:p>
             <w:pPr>
@@ -1702,7 +1720,7 @@
         </w:tc>
         <w:tc>
           <w:tcPr>
-            <w:tcW w:type="dxa" w:w="3402"/>
+            <w:tcW w:type="dxa" w:w="3118"/>
           </w:tcPr>
           <w:p>
             <w:pPr>
@@ -1710,9 +1728,10 @@
             </w:pPr>
             <w:r>
               <w:rPr>
+                <w:rFonts w:ascii="Avva_Shenouda" w:hAnsi="Avva_Shenouda" w:eastAsia="Avva_Shenouda" w:cs="Avva_Shenouda"/>
                 <w:sz w:val="10"/>
               </w:rPr>
-              <w:t>Ⲧⲱⲃϩ ⲉ̀ϫⲉⲛ ⲛⲓⲥⲓϯ ⲛⲉⲙ ⲛⲓⲥⲓⲙ ⲛⲉⲙ ⲛⲓⲣⲱⲧ ⲛ̀ⲧⲉ ⲧ̀ⲕⲟⲓ ϧⲉⲛ ⲧⲁⲓⲣⲟⲙⲡⲓ ⲑⲁⲓ: ϩⲓⲛⲁ ⲛ̀ⲧⲉ Ⲡⲓⲭ̀ⲣⲓⲥⲧⲟⲥ Ⲡⲉⲛⲛⲟⲩϯ ⲥ̀ⲙⲟⲩ ⲉ̀ⲣⲱⲟⲩ: ⲛ̀ⲧⲟⲩⲁⲓⲁⲓ ⲟⲩⲟϩ ⲛ̀ⲧⲟⲩⲁ̀ϣⲁⲓ ϣⲁ ⲛ̀ⲧⲟⲩϫⲱⲕ ⲉ̀ⲃⲟⲗ ϧⲉⲛ ⲟⲩⲛⲓϣϯ ⲛ̀ⲕⲁⲣⲡⲟⲥ: ⲟⲩⲟϩ ⲛ̀ⲧⲉϥϣⲉⲛϩⲏⲧ ϧⲁ ⲡⲉϥⲡ̀ⲗⲁⲥⲙⲁ ⲉ̀ⲧⲁ ⲛⲉϥϫⲓϫ ⲑⲁⲙⲓⲟϥ: ⲛ̀ⲧⲉϥⲭⲁ ⲛⲉⲛⲛⲟⲃⲓ ⲛⲁⲛ ⲉ̀ⲃⲟⲗ.</w:t>
+              <w:t>Twbh `egen nici5 nem nicim nem nirwt `nte `tkoi qen tairompi 0ai: hina `nte Pi`xrictoc Pennov5 `cmov `erwov: `ntovaiai ovoh `ntov`a2ai 2a `ntovgwk `ebol qen ovni25 `nkarpoc: ovoh `nte42enh3t qa pe4`placma `eta ne4gig 0amio4: `nte4xa nennobi nan `ebol.</w:t>
             </w:r>
           </w:p>
         </w:tc>
@@ -1756,7 +1775,7 @@
         </w:trPr>
         <w:tc>
           <w:tcPr>
-            <w:tcW w:type="dxa" w:w="1247"/>
+            <w:tcW w:type="dxa" w:w="3118"/>
           </w:tcPr>
           <w:p>
             <w:pPr>
@@ -1788,7 +1807,7 @@
         </w:tc>
         <w:tc>
           <w:tcPr>
-            <w:tcW w:type="dxa" w:w="3402"/>
+            <w:tcW w:type="dxa" w:w="3118"/>
           </w:tcPr>
           <w:p>
             <w:pPr>
@@ -1796,9 +1815,10 @@
             </w:pPr>
             <w:r>
               <w:rPr>
+                <w:rFonts w:ascii="Avva_Shenouda" w:hAnsi="Avva_Shenouda" w:eastAsia="Avva_Shenouda" w:cs="Avva_Shenouda"/>
                 <w:sz w:val="10"/>
               </w:rPr>
-              <w:t>Ⲧⲱⲃϩ ⲉ̀ϫⲉⲛ ⲛⲓⲁ̀ⲏⲣ ⲛ̀ⲧⲉ ⲧ̀ⲫⲉ: ⲛⲉⲙ ⲛⲓⲕⲁⲣⲡⲟⲥ ⲛ̀ⲧⲉ ⲡ̀ⲕⲁϩⲓ: ⲛⲉⲙ ⲫⲁ ⲛⲓϣ̀ϣⲏⲛ ⲛⲉⲙ ⲫⲁ ⲛⲓⲙⲁⲛ̀ⲁ̀ⲗⲟⲗⲓ: ⲛⲉⲙ ϣ̀ϣⲏⲛ ⲛⲓⲃⲉⲛ ⲛ̀ⲣⲉϥϯⲕⲁⲣⲡⲟⲥ ⲉⲧ ϧⲉⲛ ϯⲟⲓⲕⲟⲩⲙⲉⲛⲏ ⲧⲏⲣⲥ: ϩⲓⲛⲁ ⲛ̀ⲧⲉ Ⲡⲓⲭ̀ⲣⲓⲥⲧⲟⲥ Ⲡⲉⲛⲛⲟⲩϯ ⲥ̀ⲙⲟⲩ ⲉ̀ⲣⲱⲟⲩ: ⲛ̀ⲧⲉϥϫⲟⲕⲟⲩ ⲉ̀ⲃⲟⲗ ϧⲉⲛ ⲟⲩϩⲓⲣⲏⲛⲏ ⲁϭⲛⲉ ⲙ̀ⲕⲁϩ: ⲛ̀ⲧⲉϥⲭⲁ ⲛⲉⲛⲛⲟⲃⲓ ⲛⲁⲛ ⲉ̀ⲃⲟⲗ.</w:t>
+              <w:t>Twbh `egen ni`a3r `nte `tfe: nem nikarpoc `nte `pkahi: nem fa ni`223n nem fa nima`n`aloli: nem `223n niben `nre45karpoc et qen 5oikovmen3 t3rc: hina `nte Pi`xrictoc Pennov5 `cmov `erwov: `nte4gokov `ebol qen ovhir3n3 a[ne `mkah: `nte4xa nennobi nan `ebol.</w:t>
             </w:r>
           </w:p>
         </w:tc>
@@ -1842,7 +1862,7 @@
         </w:trPr>
         <w:tc>
           <w:tcPr>
-            <w:tcW w:type="dxa" w:w="1247"/>
+            <w:tcW w:type="dxa" w:w="3118"/>
           </w:tcPr>
           <w:p>
             <w:pPr>
@@ -1874,7 +1894,7 @@
         </w:tc>
         <w:tc>
           <w:tcPr>
-            <w:tcW w:type="dxa" w:w="3402"/>
+            <w:tcW w:type="dxa" w:w="3118"/>
           </w:tcPr>
           <w:p>
             <w:pPr>
@@ -1882,9 +1902,10 @@
             </w:pPr>
             <w:r>
               <w:rPr>
+                <w:rFonts w:ascii="Avva_Shenouda" w:hAnsi="Avva_Shenouda" w:eastAsia="Avva_Shenouda" w:cs="Avva_Shenouda"/>
                 <w:sz w:val="10"/>
               </w:rPr>
-              <w:t>Ⲡ̀ⲣⲟⲥⲉⲩⲝⲁⲥⲑⲉ ⲩ̀ⲡⲉⲣ ⲧⲱⲛ ⲁ̀ⲅⲓⲱⲛ ⲧⲓⲙⲓⲱⲛ ⲇⲱⲣⲱⲛ ⲧⲟⲩⲧⲱⲛ ⲕⲉ ⲑⲩⲥⲓⲱⲛ ⲏ̀ⲙⲱⲛ ⲕⲉ ⲡ̀ⲣⲟⲥⲫⲉⲣⲟⲛⲧⲱⲛ.</w:t>
+              <w:t>`Procev7ac0e `vper twn `agiwn timiwn dwrwn tovtwn ke 0vciwn `3mwn ke `procferontwn.</w:t>
             </w:r>
           </w:p>
         </w:tc>
@@ -1928,7 +1949,7 @@
         </w:trPr>
         <w:tc>
           <w:tcPr>
-            <w:tcW w:type="dxa" w:w="1247"/>
+            <w:tcW w:type="dxa" w:w="3118"/>
           </w:tcPr>
           <w:p>
             <w:pPr>
@@ -1960,7 +1981,7 @@
         </w:tc>
         <w:tc>
           <w:tcPr>
-            <w:tcW w:type="dxa" w:w="3402"/>
+            <w:tcW w:type="dxa" w:w="3118"/>
           </w:tcPr>
           <w:p>
             <w:pPr>
@@ -1968,9 +1989,10 @@
             </w:pPr>
             <w:r>
               <w:rPr>
+                <w:rFonts w:ascii="Avva_Shenouda" w:hAnsi="Avva_Shenouda" w:eastAsia="Avva_Shenouda" w:cs="Avva_Shenouda"/>
                 <w:sz w:val="10"/>
               </w:rPr>
-              <w:t>Ⲛⲏⲉⲧⲱϣ ⲙⲁⲣⲟⲩⲧⲁⲟⲩⲟ̀ ⲛ̀ⲛⲓⲣⲁⲛ: ⲛ̀ⲧⲉ ⲛⲉⲛⲓⲟϯ ⲉⲑⲟⲩⲁⲃ ⲙ̀ⲡⲁⲧⲣⲓⲁⲣⲭⲏⲥ ⲉ̀ⲧⲁⲩⲉⲛⲕⲟⲧ. Ⲡ̀ϭⲟⲓⲥ ⲙⲁⲙ̀ⲧⲟⲛ ⲛ̀ⲛⲟⲩⲯⲩⲭⲏ ⲧⲏⲣⲟⲩ: ⲟⲩⲟϩ ⲛ̀ⲧⲉϥⲭⲁ ⲛⲉⲛⲛⲟⲃⲓ ⲛⲁⲛ ⲉ̀ⲃⲟⲗ.</w:t>
+              <w:t>N3etw2 marovtaov`o `nniran: `nte nenio5 e0ovab `mpatriarx3c `etavenkot. `P[oic ma`mton `nnovyvx3 t3rov: ovoh `nte4xa nennobi nan `ebol.</w:t>
             </w:r>
           </w:p>
         </w:tc>
@@ -2014,7 +2036,7 @@
         </w:trPr>
         <w:tc>
           <w:tcPr>
-            <w:tcW w:type="dxa" w:w="1247"/>
+            <w:tcW w:type="dxa" w:w="3118"/>
           </w:tcPr>
           <w:p>
             <w:pPr>
@@ -2046,7 +2068,7 @@
         </w:tc>
         <w:tc>
           <w:tcPr>
-            <w:tcW w:type="dxa" w:w="3402"/>
+            <w:tcW w:type="dxa" w:w="3118"/>
           </w:tcPr>
           <w:p>
             <w:pPr>
@@ -2054,9 +2076,10 @@
             </w:pPr>
             <w:r>
               <w:rPr>
+                <w:rFonts w:ascii="Avva_Shenouda" w:hAnsi="Avva_Shenouda" w:eastAsia="Avva_Shenouda" w:cs="Avva_Shenouda"/>
                 <w:sz w:val="10"/>
               </w:rPr>
-              <w:t>Ⲁ̀ⲙⲏⲛ ⲁ̀ⲙⲏⲛ ⲡ̀ⲣⲟⲥⲉⲩⲝⲁⲥⲑⲉ.</w:t>
+              <w:t>`Am3n `am3n `procev7ac0e.</w:t>
             </w:r>
           </w:p>
         </w:tc>
@@ -2100,7 +2123,7 @@
         </w:trPr>
         <w:tc>
           <w:tcPr>
-            <w:tcW w:type="dxa" w:w="1247"/>
+            <w:tcW w:type="dxa" w:w="3118"/>
           </w:tcPr>
           <w:p>
             <w:pPr>
@@ -2132,7 +2155,7 @@
         </w:tc>
         <w:tc>
           <w:tcPr>
-            <w:tcW w:type="dxa" w:w="3402"/>
+            <w:tcW w:type="dxa" w:w="3118"/>
           </w:tcPr>
           <w:p>
             <w:pPr>
@@ -2140,9 +2163,10 @@
             </w:pPr>
             <w:r>
               <w:rPr>
+                <w:rFonts w:ascii="Avva_Shenouda" w:hAnsi="Avva_Shenouda" w:eastAsia="Avva_Shenouda" w:cs="Avva_Shenouda"/>
                 <w:sz w:val="10"/>
               </w:rPr>
-              <w:t>Ⲧⲁⲥ ⲕⲉⲫⲁⲗⲁⲥ ⲩ̀ⲙⲱⲛ ⲧⲱ Ⲕⲩⲣⲓⲱ ⲕ̀ⲗⲓⲛⲁⲧⲉ.</w:t>
+              <w:t>Tac kefalac `vmwn tw Kvriw `klinate.</w:t>
             </w:r>
           </w:p>
         </w:tc>
@@ -2186,7 +2210,7 @@
         </w:trPr>
         <w:tc>
           <w:tcPr>
-            <w:tcW w:type="dxa" w:w="1247"/>
+            <w:tcW w:type="dxa" w:w="3118"/>
           </w:tcPr>
           <w:p>
             <w:pPr>
@@ -2218,7 +2242,7 @@
         </w:tc>
         <w:tc>
           <w:tcPr>
-            <w:tcW w:type="dxa" w:w="3402"/>
+            <w:tcW w:type="dxa" w:w="3118"/>
           </w:tcPr>
           <w:p>
             <w:pPr>
@@ -2226,9 +2250,10 @@
             </w:pPr>
             <w:r>
               <w:rPr>
+                <w:rFonts w:ascii="Avva_Shenouda" w:hAnsi="Avva_Shenouda" w:eastAsia="Avva_Shenouda" w:cs="Avva_Shenouda"/>
                 <w:sz w:val="10"/>
               </w:rPr>
-              <w:t>Ⲡ̀ⲣⲟⲥⲭⲱⲙⲉⲛ Ⲑⲉⲟⲩ ⲙⲉⲧⲁ ⲫⲟⲃⲟⲩ. Ⲁ̀ⲙⲏⲛ.</w:t>
+              <w:t>`Procxwmen )eov meta fobov. `Am3n.</w:t>
             </w:r>
           </w:p>
         </w:tc>
@@ -2272,7 +2297,7 @@
         </w:trPr>
         <w:tc>
           <w:tcPr>
-            <w:tcW w:type="dxa" w:w="1247"/>
+            <w:tcW w:type="dxa" w:w="3118"/>
           </w:tcPr>
           <w:p>
             <w:pPr>
@@ -2304,7 +2329,7 @@
         </w:tc>
         <w:tc>
           <w:tcPr>
-            <w:tcW w:type="dxa" w:w="3402"/>
+            <w:tcW w:type="dxa" w:w="3118"/>
           </w:tcPr>
           <w:p>
             <w:pPr>
@@ -2312,9 +2337,10 @@
             </w:pPr>
             <w:r>
               <w:rPr>
+                <w:rFonts w:ascii="Avva_Shenouda" w:hAnsi="Avva_Shenouda" w:eastAsia="Avva_Shenouda" w:cs="Avva_Shenouda"/>
                 <w:sz w:val="10"/>
               </w:rPr>
-              <w:t>Ⲥⲱⲑⲓⲥ ⲁ̀ⲙⲏⲛ: ⲕⲉ ⲧⲱ ⲡ̀ⲛⲉⲩⲙⲁⲧⲓ ⲥⲟⲩ: ⲙⲉⲧⲁ ⲫⲟⲃⲟⲩ Ⲑⲉⲟⲩ ⲡ̀ⲣⲟⲥⲭⲱⲙⲉⲛ.</w:t>
+              <w:t>Cw0ic `am3n: ke tw `pnevmati cov: meta fobov )eov `procxwmen.</w:t>
             </w:r>
           </w:p>
         </w:tc>
@@ -2358,7 +2384,7 @@
         </w:trPr>
         <w:tc>
           <w:tcPr>
-            <w:tcW w:type="dxa" w:w="1247"/>
+            <w:tcW w:type="dxa" w:w="3118"/>
           </w:tcPr>
           <w:p>
             <w:pPr>
@@ -2390,7 +2416,7 @@
         </w:tc>
         <w:tc>
           <w:tcPr>
-            <w:tcW w:type="dxa" w:w="3402"/>
+            <w:tcW w:type="dxa" w:w="3118"/>
           </w:tcPr>
           <w:p>
             <w:pPr>
@@ -2398,9 +2424,10 @@
             </w:pPr>
             <w:r>
               <w:rPr>
+                <w:rFonts w:ascii="Avva_Shenouda" w:hAnsi="Avva_Shenouda" w:eastAsia="Avva_Shenouda" w:cs="Avva_Shenouda"/>
                 <w:sz w:val="10"/>
               </w:rPr>
-              <w:t>Ⲁ̀ⲙⲏⲛ ⲁ̀ⲙⲏⲛ ⲁ̀ⲙⲏⲛ: ϯⲛⲁϩϯ ϯⲛⲁϩϯ ϯⲛⲁϩϯ ϫⲉ ⲑⲁⲓ ⲧⲉ ϧⲉⲛ ⲟⲩⲙⲉⲑⲙⲏⲓ. Ⲁ̀ⲙⲏⲛ. Ⲧⲱⲃϩ ⲉ̀ϩ̀ⲣⲏⲓ ⲉ̀ϫⲱⲛ ⲛⲉⲙ ⲉ̀ϫⲉⲛ ⲭ̀ⲣⲓⲥⲧⲓⲁⲛⲟⲥ ⲛⲓⲃⲉⲛ ⲉ̀ⲧⲁⲩϫⲟⲥ ⲛⲁⲛ ⲉⲑⲃⲏⲧⲟⲩ: ϫⲉ ⲁ̀ⲣⲓⲡⲉⲛⲙⲉⲩⲓ ϧⲉⲛ ⲡ̀ⲏⲓ ⲙ̀Ⲡ̀ϭⲟⲓⲥ. Ⲏ̀ ⲓ̀ⲣⲏⲛⲏ ⲕⲉ ⲁ̀ⲅⲁⲡⲓ Ⲓⲏⲥⲟⲩ Ⲭ̀ⲣⲓⲥⲧⲟⲩ ⲙⲉⲑ ⲩ̀ⲙⲱⲛ: ⲯⲁⲗⲗⲁⲧⲉ ϫⲱ ⲁⲗⲗⲏⲗⲟⲩⲓⲁ. Ⲡ̀ⲣⲟⲥⲉⲩⲝⲁⲥⲑⲉ ⲩ̀ⲡⲉⲣ ⲧⲏⲥ ⲁⲝⲓⲁⲥ ⲙⲉⲧⲁⲗⲏⲯⲉⲱⲥ ⲁⲭⲣⲁⲛⲧⲱⲛ ⲕⲉ ⲉ̀ⲡⲟⲩⲣⲁⲛⲓⲱⲛ ⲧⲱⲛ ⲁ̀ⲅⲓⲱⲛ Ⲙⲩⲥⲧⲏⲣⲓⲱⲛ. Ⲕⲩⲣⲓⲉ ⲉ̀ⲗⲉⲏ̀ⲥⲟⲛ.</w:t>
+              <w:t>`Am3n `am3n `am3n: 5nah5 5nah5 5nah5 ge 0ai te qen ovme0m3i. `Am3n. Twbh `e`hr3i `egwn nem `egen `xrictianoc niben `etavgoc nan e0b3tov: ge `aripenmevi qen `p3i `m`P[oic. `# `ir3n3 ke `agapi I3cov `Xrictov me0 `vmwn: yallate gw all3lovia. `Procev7ac0e `vper t3c a7iac metal3yewc axrantwn ke `epovraniwn twn `agiwn Mvct3riwn. Kvrie `ele`3con.</w:t>
             </w:r>
           </w:p>
         </w:tc>

</xml_diff>